<commit_message>
docs: remove unpublished reference [5] from midterm report
Co-Authored-By: Claude Sonnet 5.5 <noreply@anthropic.com>
Claude-Session: https://claude.ai/code/session_01VSpw28v5isHVMvy4aXwzyp
</commit_message>
<xml_diff>
--- a/docs/midterm-report-revised-2026-10-31.docx
+++ b/docs/midterm-report-revised-2026-10-31.docx
@@ -1511,7 +1511,7 @@
         <w:widowControl/>
       </w:pPr>
       <w:r>
-        <w:t>다이별 요청 큐(die queue)는 해당 다이가 처리할 NAND 요청을 보관한다. 실습 펌웨어는 먼저 들어온 요청부터 처리하는 FIFO(First In First Out)를 사용하며, 채널 수준의 읽기 우선 처리는 각 다이의 맨 앞 요청 사이에서만 적용된다[5].</w:t>
+        <w:t>다이별 요청 큐(die queue)는 해당 다이가 처리할 NAND 요청을 보관한다. 실습 펌웨어는 먼저 들어온 요청부터 처리하는 FIFO(First In First Out)를 사용하며, 채널 수준의 읽기 우선 처리는 각 다이의 맨 앞 요청 사이에서만 적용된다.</w:t>
       </w:r>
     </w:p>
     <w:p>
@@ -1592,7 +1592,7 @@
         <w:widowControl/>
       </w:pPr>
       <w:r>
-        <w:t>출처: 팀 논문[5] 그림 1. 원 논문[1]의 그림을 참고하여 작성하였다.</w:t>
+        <w:t>출처: 원 논문[1]의 그림을 참고하여 직접 작성하였다.</w:t>
       </w:r>
     </w:p>
     <w:p>
@@ -2057,7 +2057,7 @@
         <w:widowControl/>
       </w:pPr>
       <w:r>
-        <w:t>R-Buf는 버퍼 대기를 줄이는 기법이며 다이 큐 내부의 선행 요청 순서를 바꾸는 기법은 아니다[1,5]. 본 보고서가 사용한 펌웨어에서 채널 수준의 읽기 우선은 각 다이 큐의 맨 앞 요청 사이에서만 작동하므로, 큐 안의 선행 쓰기 요청은 그대로 남는다. 우리 측정에서 R-Buf의 펌웨어 내부 지연시간 p99는 9.11ms였고, p99 초과 읽기 요청의 단계별 평균 지연 중 다이 큐 대기는 97%였다. NAND와 직접 메모리 접근 DMA(Direct Memory Access) 처리는 약 0.25ms에 불과하였다.</w:t>
+        <w:t>R-Buf는 버퍼 대기를 줄이는 기법이며 다이 큐 내부의 선행 요청 순서를 바꾸는 기법은 아니다[1]. 본 보고서가 사용한 펌웨어에서 채널 수준의 읽기 우선은 각 다이 큐의 맨 앞 요청 사이에서만 작동하므로, 큐 안의 선행 쓰기 요청은 그대로 남는다. 우리 측정에서 R-Buf의 펌웨어 내부 지연시간 p99는 9.11ms였고, p99 초과 읽기 요청의 단계별 평균 지연 중 다이 큐 대기는 97%였다. NAND와 직접 메모리 접근 DMA(Direct Memory Access) 처리는 약 0.25ms에 불과하였다.</w:t>
       </w:r>
     </w:p>
     <w:p>
@@ -2090,7 +2090,7 @@
         <w:widowControl/>
       </w:pPr>
       <w:r>
-        <w:t>주 평가 범위는 명령을 가져온 시각부터 호스트 DMA 완료를 확인한 시각까지의 펌웨어 내부 지연시간으로 한정한다. 이는 팀 논문[5]의 계측 시각 ②~⑫에 해당한다. 호스트 지연시간은 보조 지표로 기록하고, 호스트에서 관찰한 정지 현상은 분리하여 분석한다.</w:t>
+        <w:t>주 평가 범위는 명령을 가져온 시각부터 호스트 DMA 완료를 확인한 시각까지의 펌웨어 내부 지연시간으로 한정한다. 이는 본 팀이 정의한 계측 시각 ②~⑫(그림 6)에 해당한다. 호스트 지연시간은 보조 지표로 기록하고, 호스트에서 관찰한 정지 현상은 분리하여 분석한다.</w:t>
       </w:r>
     </w:p>
     <w:p>
@@ -3035,7 +3035,7 @@
                 <w:b w:val="0"/>
                 <w:sz w:val="19"/>
               </w:rPr>
-              <w:t>Cosmos+ OpenSSD, GreedyFTL 기반 실습 펌웨어[4,5]</w:t>
+              <w:t>Cosmos+ OpenSSD, GreedyFTL 기반 실습 펌웨어[4]</w:t>
             </w:r>
           </w:p>
         </w:tc>
@@ -4458,7 +4458,7 @@
         <w:widowControl/>
       </w:pPr>
       <w:r>
-        <w:t>출처: 팀 논문[5] 그림 2. ①~⑭는 처리 순서이며 ②~⑫가 펌웨어 내부 지연시간의 구간이다.</w:t>
+        <w:t>출처: 직접 작성. ①~⑭는 처리 순서이며 ②~⑫가 펌웨어 내부 지연시간의 구간이다.</w:t>
       </w:r>
     </w:p>
     <w:p>
@@ -4509,7 +4509,7 @@
         <w:widowControl/>
       </w:pPr>
       <w:r>
-        <w:t>본 절은 팀 논문[5]의 결과를 요약한다. 핵심 결과는 세 가지이다. 첫째, QD1에서 R-Buf는 버퍼 대기를 없애 펌웨어 내부 p99를 17.63ms에서 9.11ms로 약 48.3% 줄였다. 둘째, R-Buf 이후 남은 꼬리 지연의 97%는 다이 큐 대기였다. 셋째, 이 대기는 선행 요청 수에 비례하여 선행 요청 하나당 약 0.58ms씩 늘었다.</w:t>
+        <w:t>본 절은 본 팀의 선행 실험 결과를 요약한다. 핵심 결과는 세 가지이다. 첫째, QD1에서 R-Buf는 버퍼 대기를 없애 펌웨어 내부 p99를 17.63ms에서 9.11ms로 약 48.3% 줄였다. 둘째, R-Buf 이후 남은 꼬리 지연의 97%는 다이 큐 대기였다. 셋째, 이 대기는 선행 요청 수에 비례하여 선행 요청 하나당 약 0.58ms씩 늘었다.</w:t>
       </w:r>
     </w:p>
     <w:p>
@@ -5393,7 +5393,7 @@
         <w:spacing w:before="100"/>
       </w:pPr>
       <w:r>
-        <w:t>출처: 팀 논문[5] 표 2. 호스트 지연시간과 구분한다.</w:t>
+        <w:t>출처: 본 팀의 선행 실험. 호스트 지연시간과 구분한다.</w:t>
       </w:r>
     </w:p>
     <w:p>
@@ -5474,7 +5474,7 @@
         <w:widowControl/>
       </w:pPr>
       <w:r>
-        <w:t>출처: 팀 논문[5] 그림 3. W_buf는 버퍼 대기, W_die는 다이 큐 대기, T_nand는 NAND·DMA 처리 시간이다.</w:t>
+        <w:t>출처: 본 팀의 선행 실험. W_buf는 버퍼 대기, W_die는 다이 큐 대기, T_nand는 NAND·DMA 처리 시간이다.</w:t>
       </w:r>
     </w:p>
     <w:p>
@@ -5627,7 +5627,7 @@
         <w:widowControl/>
       </w:pPr>
       <w:r>
-        <w:t>출처: 팀 논문[5] 그림 4. 점은 선행 요청 수별 W_die의 중앙값이며 점선은 식 (3)이다.</w:t>
+        <w:t>출처: 본 팀의 선행 실험. 점은 선행 요청 수별 W_die의 중앙값이며 점선은 식 (3)이다.</w:t>
       </w:r>
     </w:p>
     <w:p>
@@ -11059,15 +11059,6 @@
       </w:pPr>
       <w:r>
         <w:t>[4] J. Kwak, S. Lee, K. Park, J. Jeong, and Y. H. Song, “Cosmos+ OpenSSD: Rapid Prototype for Flash Storage Systems,” ACM Transactions on Storage, vol. 16, no. 3, article 15, pp. 1–35, 2020. DOI: 10.1145/3385073.</w:t>
-      </w:r>
-    </w:p>
-    <w:p>
-      <w:pPr>
-        <w:pStyle w:val="Small"/>
-        <w:widowControl/>
-      </w:pPr>
-      <w:r>
-        <w:t>[5] 정희찬, 서준호, 안태현, 김보겸, 성진욱, 최건희, 「지속 쓰기 부하에서 R-Buf 적용 후 남는 읽기 요청 지연시간의 단계별 분석」, 팀 논문 출판용 원고. [확인 필요: 게재 학술대회, 연도와 쪽수].</w:t>
       </w:r>
     </w:p>
     <w:sectPr>

</xml_diff>